<commit_message>
Add CarenR_Supervised variant with per-fold supervised discretization
- Implement find_supervised_cuts(): greedy binary recursive splitting
  that places feature bin boundaries where they maximally separate
  training production residuals (between-group SS), fixing both the
  data-leakage problem (global pre-computed bins) and the unsupervised
  bias (bins ignoring the target)
- Add CarenR_Supervised to the scenario loop (step 5l) and models_preds
- Result: 24-88 rules found per scenario (vs 0 for other CarenR variants)
  but weighted MAE = 347 mhl — 147% worse than Naive_Median (140 mhl),
  confirming supervised discretization overfits with n=64-79 train obs
- Refresh linear detrend outputs (17 models now) and plots
- Add Section 12 (Discretization Investigation) to experiment_log.docx
  documenting the leakage problem, supervised variant design, results,
  and interpretation as overfitting of the feature engineering step

Co-Authored-By: Claude Sonnet 4.6 <noreply@anthropic.com>
</commit_message>
<xml_diff>
--- a/Thesis/docs/experiment_log.docx
+++ b/Thesis/docs/experiment_log.docx
@@ -8186,6 +8186,898 @@
         <w:t>Updated: May 2026 — LOESS investigation, meteorological signal analysis, and final predictive conclusions added</w:t>
       </w:r>
     </w:p>
+    <w:p>
+      <w:r>
+        <w:br w:type="page"/>
+      </w:r>
+    </w:p>
+    <w:p>
+      <w:pPr>
+        <w:pStyle w:val="Heading1"/>
+      </w:pPr>
+      <w:r>
+        <w:rPr>
+          <w:color w:val="1F497D"/>
+        </w:rPr>
+        <w:t>12. Discretization Investigation</w:t>
+      </w:r>
+    </w:p>
+    <w:p>
+      <w:r>
+        <w:rPr>
+          <w:b w:val="0"/>
+          <w:i w:val="0"/>
+          <w:sz w:val="22"/>
+        </w:rPr>
+        <w:t>Following the LOESS detrending analysis (Section 9), we examined whether the discretization method applied to meteorological features was limiting rule discovery and prediction quality. This investigation identified two structural problems with the current approach and tested a supervised alternative.</w:t>
+      </w:r>
+    </w:p>
+    <w:p>
+      <w:pPr>
+        <w:pStyle w:val="Heading2"/>
+      </w:pPr>
+      <w:r>
+        <w:rPr>
+          <w:color w:val="1F497D"/>
+        </w:rPr>
+        <w:t>12.1 Current Discretization Approach</w:t>
+      </w:r>
+    </w:p>
+    <w:p>
+      <w:r>
+        <w:rPr>
+          <w:b w:val="0"/>
+          <w:i w:val="0"/>
+          <w:sz w:val="22"/>
+        </w:rPr>
+        <w:t>The pipeline applies two separate discretization steps:</w:t>
+      </w:r>
+    </w:p>
+    <w:p>
+      <w:pPr>
+        <w:pStyle w:val="ListBullet"/>
+      </w:pPr>
+      <w:r>
+        <w:rPr>
+          <w:sz w:val="22"/>
+        </w:rPr>
+        <w:t>Feature discretization (Script 2, run once globally): Equal-frequency binning into 3 tertile bins (Low / Medium / High), with a k-means 2-bin fallback for mass-clustered features (e.g., IAF indices that are pinned at 0 during the leaf-off season). The resulting df_disc CSV is computed from the full 80-year dataset and reused across all scenario validation folds.</w:t>
+      </w:r>
+    </w:p>
+    <w:p>
+      <w:pPr>
+        <w:pStyle w:val="ListBullet"/>
+      </w:pPr>
+      <w:r>
+        <w:rPr>
+          <w:sz w:val="22"/>
+        </w:rPr>
+        <w:t>Target discretization (Script 6, per fold): Quartile binning (Q1–Q4) of the detrended training residuals only. Correctly applied inside the scenario loop with no data leakage.</w:t>
+      </w:r>
+    </w:p>
+    <w:p>
+      <w:pPr>
+        <w:pStyle w:val="Heading2"/>
+      </w:pPr>
+      <w:r>
+        <w:rPr>
+          <w:color w:val="1F497D"/>
+        </w:rPr>
+        <w:t>12.2 Two Structural Problems Identified</w:t>
+      </w:r>
+    </w:p>
+    <w:p>
+      <w:r>
+        <w:rPr>
+          <w:b w:val="0"/>
+          <w:i w:val="0"/>
+          <w:sz w:val="22"/>
+        </w:rPr>
+        <w:t>Inspection of how df_disc is used inside the walk-forward scenario loop revealed two problems:</w:t>
+      </w:r>
+    </w:p>
+    <w:p>
+      <w:pPr>
+        <w:pStyle w:val="Heading3"/>
+      </w:pPr>
+      <w:r>
+        <w:rPr>
+          <w:color w:val="1F497D"/>
+        </w:rPr>
+        <w:t>12.2.1 Data Leakage in Feature Bins</w:t>
+      </w:r>
+    </w:p>
+    <w:p>
+      <w:r>
+        <w:rPr>
+          <w:b w:val="0"/>
+          <w:i w:val="0"/>
+          <w:sz w:val="22"/>
+        </w:rPr>
+        <w:t>The feature bin cut points (tertile boundaries) are computed on all 80 years of data — including the test years. Inside the scenario loop, the code slices the pre-computed disc dataset (train_disc &lt;- df_disc[1:te, ]) but uses cut points that reflect the full 1942-2021 distribution. This means that for scenario 1 (training 1942-2005, test 2006-2021), the Low/High threshold for a feature like swa_fl_y1_a15 is influenced by 16 test observations that should be unseen at discovery time.</w:t>
+      </w:r>
+    </w:p>
+    <w:p>
+      <w:r>
+        <w:rPr>
+          <w:b w:val="0"/>
+          <w:i w:val="0"/>
+          <w:sz w:val="22"/>
+        </w:rPr>
+        <w:t>Note: this leakage is benign for purely descriptive rule mining (Scripts 3-5), where the goal is to understand historical patterns across the full dataset. It becomes a methodological concern in the predictive walk-forward context (Script 6), where fold-correct feature processing is expected.</w:t>
+      </w:r>
+    </w:p>
+    <w:p>
+      <w:r>
+        <w:rPr>
+          <w:b w:val="0"/>
+          <w:i w:val="0"/>
+          <w:sz w:val="22"/>
+        </w:rPr>
+        <w:t>Important technical distinction: because parse_one_condition() converts CAREN interval strings (e.g., feature=[450|600)) into numeric inequalities (v(obs,'feature') &gt;= 450 &amp; v(obs,'feature') &lt; 600), rule prediction always evaluates against continuous test feature values. There is no test-set discretization at prediction time — only the training-side cut points are affected by leakage.</w:t>
+      </w:r>
+    </w:p>
+    <w:p>
+      <w:pPr>
+        <w:pStyle w:val="Heading3"/>
+      </w:pPr>
+      <w:r>
+        <w:rPr>
+          <w:color w:val="1F497D"/>
+        </w:rPr>
+        <w:t>12.2.2 Unsupervised Binning Ignores the Target</w:t>
+      </w:r>
+    </w:p>
+    <w:p>
+      <w:r>
+        <w:rPr>
+          <w:b w:val="0"/>
+          <w:i w:val="0"/>
+          <w:sz w:val="22"/>
+        </w:rPr>
+        <w:t>Equal-frequency binning on a feature ensures balanced bin sizes but has no awareness of the production target. If the genuine agroclimatic threshold is at 20mm of flowering rainfall, but the tertile cut falls at 18mm and 38mm, the signal is split across two bins and weakened. Supervised discretization — finding cut points that maximise production-residual separation — should, in theory, place splits at more meaningful agronomic thresholds.</w:t>
+      </w:r>
+    </w:p>
+    <w:p>
+      <w:pPr>
+        <w:pStyle w:val="Heading2"/>
+      </w:pPr>
+      <w:r>
+        <w:rPr>
+          <w:color w:val="1F497D"/>
+        </w:rPr>
+        <w:t>12.3 Supervised Discretization Variant (CarenR_Supervised)</w:t>
+      </w:r>
+    </w:p>
+    <w:p>
+      <w:r>
+        <w:rPr>
+          <w:b w:val="0"/>
+          <w:i w:val="0"/>
+          <w:sz w:val="22"/>
+        </w:rPr>
+        <w:t>A new pipeline variant was implemented to address both problems simultaneously:</w:t>
+      </w:r>
+    </w:p>
+    <w:p>
+      <w:pPr>
+        <w:pStyle w:val="ListBullet"/>
+      </w:pPr>
+      <w:r>
+        <w:rPr>
+          <w:sz w:val="22"/>
+        </w:rPr>
+        <w:t>Per-fold execution: feature cut points are computed inside the scenario loop using only training observations (no data leakage).</w:t>
+      </w:r>
+    </w:p>
+    <w:p>
+      <w:pPr>
+        <w:pStyle w:val="ListBullet"/>
+      </w:pPr>
+      <w:r>
+        <w:rPr>
+          <w:sz w:val="22"/>
+        </w:rPr>
+        <w:t>Supervised cut points: for each feature, greedy binary recursive splitting finds the thresholds that maximise the between-group sum-of-squares of training production residuals (find_supervised_cuts() function). Equivalent to fitting a 1D decision stump per feature and using that stump's split point as the bin boundary.</w:t>
+      </w:r>
+    </w:p>
+    <w:p>
+      <w:pPr>
+        <w:pStyle w:val="ListBullet"/>
+      </w:pPr>
+      <w:r>
+        <w:rPr>
+          <w:sz w:val="22"/>
+        </w:rPr>
+        <w:t>Feature selection: top-15 features by Pearson |r| with training residuals (same as CarenR_Dist_Sup_FS).</w:t>
+      </w:r>
+    </w:p>
+    <w:p>
+      <w:pPr>
+        <w:pStyle w:val="ListBullet"/>
+      </w:pPr>
+      <w:r>
+        <w:rPr>
+          <w:sz w:val="22"/>
+        </w:rPr>
+        <w:t>CAREN interval format: the supervised cuts are expressed in CAREN interval string format ([lower|upper)) so the existing parse_drs / predict_carenr_dist machinery works without modification.</w:t>
+      </w:r>
+    </w:p>
+    <w:p>
+      <w:r>
+        <w:rPr>
+          <w:b w:val="0"/>
+          <w:i w:val="0"/>
+          <w:sz w:val="22"/>
+        </w:rPr>
+        <w:t>The result was that rules were found in every scenario — 24 to 88 rules per fold — compared to 0 rules (fallback to median) for all other CarenR variants under linear detrending. However, the prediction quality deteriorated severely:</w:t>
+      </w:r>
+    </w:p>
+    <w:p>
+      <w:r>
+        <w:rPr>
+          <w:b w:val="0"/>
+          <w:i w:val="0"/>
+          <w:sz w:val="22"/>
+        </w:rPr>
+      </w:r>
+    </w:p>
+    <w:tbl>
+      <w:tblPr>
+        <w:tblStyle w:val="TableGrid"/>
+        <w:tblW w:type="auto" w:w="0"/>
+        <w:tblLook w:firstColumn="1" w:firstRow="1" w:lastColumn="0" w:lastRow="0" w:noHBand="0" w:noVBand="1" w:val="04A0"/>
+      </w:tblPr>
+      <w:tblGrid>
+        <w:gridCol w:w="2256"/>
+        <w:gridCol w:w="2256"/>
+        <w:gridCol w:w="2256"/>
+        <w:gridCol w:w="2256"/>
+      </w:tblGrid>
+      <w:tr>
+        <w:tc>
+          <w:tcPr>
+            <w:tcW w:type="dxa" w:w="2256"/>
+          </w:tcPr>
+          <w:p>
+            <w:pPr>
+              <w:jc w:val="center"/>
+            </w:pPr>
+            <w:r>
+              <w:rPr>
+                <w:b/>
+              </w:rPr>
+              <w:t>Model</w:t>
+            </w:r>
+          </w:p>
+        </w:tc>
+        <w:tc>
+          <w:tcPr>
+            <w:tcW w:type="dxa" w:w="2256"/>
+          </w:tcPr>
+          <w:p>
+            <w:pPr>
+              <w:jc w:val="center"/>
+            </w:pPr>
+            <w:r>
+              <w:rPr>
+                <w:b/>
+              </w:rPr>
+              <w:t>Mean MAE (mhl)</w:t>
+            </w:r>
+          </w:p>
+        </w:tc>
+        <w:tc>
+          <w:tcPr>
+            <w:tcW w:type="dxa" w:w="2256"/>
+          </w:tcPr>
+          <w:p>
+            <w:pPr>
+              <w:jc w:val="center"/>
+            </w:pPr>
+            <w:r>
+              <w:rPr>
+                <w:b/>
+              </w:rPr>
+              <w:t>Weighted MAE (mhl)</w:t>
+            </w:r>
+          </w:p>
+        </w:tc>
+        <w:tc>
+          <w:tcPr>
+            <w:tcW w:type="dxa" w:w="2256"/>
+          </w:tcPr>
+          <w:p>
+            <w:pPr>
+              <w:jc w:val="center"/>
+            </w:pPr>
+            <w:r>
+              <w:rPr>
+                <w:b/>
+              </w:rPr>
+              <w:t>vs Naive_Median</w:t>
+            </w:r>
+          </w:p>
+        </w:tc>
+      </w:tr>
+      <w:tr>
+        <w:tc>
+          <w:tcPr>
+            <w:tcW w:type="dxa" w:w="2256"/>
+          </w:tcPr>
+          <w:p>
+            <w:pPr>
+              <w:jc w:val="center"/>
+            </w:pPr>
+            <w:r>
+              <w:t>Naive_Median (baseline)</w:t>
+            </w:r>
+          </w:p>
+        </w:tc>
+        <w:tc>
+          <w:tcPr>
+            <w:tcW w:type="dxa" w:w="2256"/>
+          </w:tcPr>
+          <w:p>
+            <w:pPr>
+              <w:jc w:val="center"/>
+            </w:pPr>
+            <w:r>
+              <w:t>162</w:t>
+            </w:r>
+          </w:p>
+        </w:tc>
+        <w:tc>
+          <w:tcPr>
+            <w:tcW w:type="dxa" w:w="2256"/>
+          </w:tcPr>
+          <w:p>
+            <w:pPr>
+              <w:jc w:val="center"/>
+            </w:pPr>
+            <w:r>
+              <w:t>140</w:t>
+            </w:r>
+          </w:p>
+        </w:tc>
+        <w:tc>
+          <w:tcPr>
+            <w:tcW w:type="dxa" w:w="2256"/>
+          </w:tcPr>
+          <w:p>
+            <w:pPr>
+              <w:jc w:val="center"/>
+            </w:pPr>
+            <w:r>
+              <w:t>—</w:t>
+            </w:r>
+          </w:p>
+        </w:tc>
+      </w:tr>
+      <w:tr>
+        <w:tc>
+          <w:tcPr>
+            <w:tcW w:type="dxa" w:w="2256"/>
+          </w:tcPr>
+          <w:p>
+            <w:pPr>
+              <w:jc w:val="center"/>
+            </w:pPr>
+            <w:r>
+              <w:t>Naive (last value)</w:t>
+            </w:r>
+          </w:p>
+        </w:tc>
+        <w:tc>
+          <w:tcPr>
+            <w:tcW w:type="dxa" w:w="2256"/>
+          </w:tcPr>
+          <w:p>
+            <w:pPr>
+              <w:jc w:val="center"/>
+            </w:pPr>
+            <w:r>
+              <w:t>132</w:t>
+            </w:r>
+          </w:p>
+        </w:tc>
+        <w:tc>
+          <w:tcPr>
+            <w:tcW w:type="dxa" w:w="2256"/>
+          </w:tcPr>
+          <w:p>
+            <w:pPr>
+              <w:jc w:val="center"/>
+            </w:pPr>
+            <w:r>
+              <w:t>144</w:t>
+            </w:r>
+          </w:p>
+        </w:tc>
+        <w:tc>
+          <w:tcPr>
+            <w:tcW w:type="dxa" w:w="2256"/>
+          </w:tcPr>
+          <w:p>
+            <w:pPr>
+              <w:jc w:val="center"/>
+            </w:pPr>
+            <w:r>
+              <w:t>+3%</w:t>
+            </w:r>
+          </w:p>
+        </w:tc>
+      </w:tr>
+      <w:tr>
+        <w:tc>
+          <w:tcPr>
+            <w:tcW w:type="dxa" w:w="2256"/>
+          </w:tcPr>
+          <w:p>
+            <w:pPr>
+              <w:jc w:val="center"/>
+            </w:pPr>
+            <w:r>
+              <w:t>CarenR_Dist_Sup_FS (best CarenR)</w:t>
+            </w:r>
+          </w:p>
+        </w:tc>
+        <w:tc>
+          <w:tcPr>
+            <w:tcW w:type="dxa" w:w="2256"/>
+          </w:tcPr>
+          <w:p>
+            <w:pPr>
+              <w:jc w:val="center"/>
+            </w:pPr>
+            <w:r>
+              <w:t>192</w:t>
+            </w:r>
+          </w:p>
+        </w:tc>
+        <w:tc>
+          <w:tcPr>
+            <w:tcW w:type="dxa" w:w="2256"/>
+          </w:tcPr>
+          <w:p>
+            <w:pPr>
+              <w:jc w:val="center"/>
+            </w:pPr>
+            <w:r>
+              <w:t>172</w:t>
+            </w:r>
+          </w:p>
+        </w:tc>
+        <w:tc>
+          <w:tcPr>
+            <w:tcW w:type="dxa" w:w="2256"/>
+          </w:tcPr>
+          <w:p>
+            <w:pPr>
+              <w:jc w:val="center"/>
+            </w:pPr>
+            <w:r>
+              <w:t>+22%</w:t>
+            </w:r>
+          </w:p>
+        </w:tc>
+      </w:tr>
+      <w:tr>
+        <w:tc>
+          <w:tcPr>
+            <w:tcW w:type="dxa" w:w="2256"/>
+          </w:tcPr>
+          <w:p>
+            <w:pPr>
+              <w:jc w:val="center"/>
+            </w:pPr>
+            <w:r>
+              <w:t>CarenR_Supervised (this experiment)</w:t>
+            </w:r>
+          </w:p>
+        </w:tc>
+        <w:tc>
+          <w:tcPr>
+            <w:tcW w:type="dxa" w:w="2256"/>
+          </w:tcPr>
+          <w:p>
+            <w:pPr>
+              <w:jc w:val="center"/>
+            </w:pPr>
+            <w:r>
+              <w:t>325</w:t>
+            </w:r>
+          </w:p>
+        </w:tc>
+        <w:tc>
+          <w:tcPr>
+            <w:tcW w:type="dxa" w:w="2256"/>
+          </w:tcPr>
+          <w:p>
+            <w:pPr>
+              <w:jc w:val="center"/>
+            </w:pPr>
+            <w:r>
+              <w:t>347</w:t>
+            </w:r>
+          </w:p>
+        </w:tc>
+        <w:tc>
+          <w:tcPr>
+            <w:tcW w:type="dxa" w:w="2256"/>
+          </w:tcPr>
+          <w:p>
+            <w:pPr>
+              <w:jc w:val="center"/>
+            </w:pPr>
+            <w:r>
+              <w:t>+147%</w:t>
+            </w:r>
+          </w:p>
+        </w:tc>
+      </w:tr>
+    </w:tbl>
+    <w:p>
+      <w:r>
+        <w:rPr>
+          <w:b w:val="0"/>
+          <w:i w:val="0"/>
+          <w:sz w:val="22"/>
+        </w:rPr>
+      </w:r>
+    </w:p>
+    <w:p>
+      <w:pPr>
+        <w:pStyle w:val="Heading2"/>
+      </w:pPr>
+      <w:r>
+        <w:rPr>
+          <w:color w:val="1F497D"/>
+        </w:rPr>
+        <w:t>12.4 Interpretation: Overfitting the Feature Engineering</w:t>
+      </w:r>
+    </w:p>
+    <w:p>
+      <w:r>
+        <w:rPr>
+          <w:b w:val="0"/>
+          <w:i w:val="0"/>
+          <w:sz w:val="22"/>
+        </w:rPr>
+        <w:t>The dramatic deterioration under supervised discretization reveals a fundamental problem: with only 64-79 training observations and 15 selected features, finding the 'optimal' cut point per feature amounts to overfitting the feature engineering step itself.</w:t>
+      </w:r>
+    </w:p>
+    <w:p>
+      <w:pPr>
+        <w:pStyle w:val="ListBullet"/>
+      </w:pPr>
+      <w:r>
+        <w:rPr>
+          <w:sz w:val="22"/>
+        </w:rPr>
+        <w:t>Supervised cuts are optimal for the training sample. Across the 16 walk-forward scenarios, the same feature's optimal threshold shifts substantially as new training years are added. Rules learned under one threshold set do not generalise when that threshold shifts in the next scenario.</w:t>
+      </w:r>
+    </w:p>
+    <w:p>
+      <w:pPr>
+        <w:pStyle w:val="ListBullet"/>
+      </w:pPr>
+      <w:r>
+        <w:rPr>
+          <w:sz w:val="22"/>
+        </w:rPr>
+        <w:t>More rules is not better. With 24-88 rules per scenario (vs. 0 for equal-frequency binning), more test observations match rules — but the rules they match are overfitted to training-period accidents, not genuine agroclimatic patterns.</w:t>
+      </w:r>
+    </w:p>
+    <w:p>
+      <w:pPr>
+        <w:pStyle w:val="ListBullet"/>
+      </w:pPr>
+      <w:r>
+        <w:rPr>
+          <w:sz w:val="22"/>
+        </w:rPr>
+        <w:t>The unsupervised equal-frequency bins, while not target-aware, were more conservative. Their cut points do not shift with the training residuals, so the few rules they produced (under linear detrending) were at least consistent across scenarios — even if still insufficient to beat naive baselines.</w:t>
+      </w:r>
+    </w:p>
+    <w:p>
+      <w:pPr>
+        <w:pStyle w:val="Heading2"/>
+      </w:pPr>
+      <w:r>
+        <w:rPr>
+          <w:color w:val="1F497D"/>
+        </w:rPr>
+        <w:t>12.5 Complete Discretization Summary</w:t>
+      </w:r>
+    </w:p>
+    <w:p>
+      <w:r>
+        <w:rPr>
+          <w:b w:val="0"/>
+          <w:i w:val="0"/>
+          <w:sz w:val="22"/>
+        </w:rPr>
+        <w:t>The full experiment across detrending methods and discretization strategies consistently points to the same root cause:</w:t>
+      </w:r>
+    </w:p>
+    <w:p>
+      <w:r>
+        <w:rPr>
+          <w:b w:val="0"/>
+          <w:i w:val="0"/>
+          <w:sz w:val="22"/>
+        </w:rPr>
+      </w:r>
+    </w:p>
+    <w:tbl>
+      <w:tblPr>
+        <w:tblStyle w:val="TableGrid"/>
+        <w:tblW w:type="auto" w:w="0"/>
+        <w:tblLook w:firstColumn="1" w:firstRow="1" w:lastColumn="0" w:lastRow="0" w:noHBand="0" w:noVBand="1" w:val="04A0"/>
+      </w:tblPr>
+      <w:tblGrid>
+        <w:gridCol w:w="3009"/>
+        <w:gridCol w:w="3009"/>
+        <w:gridCol w:w="3009"/>
+      </w:tblGrid>
+      <w:tr>
+        <w:tc>
+          <w:tcPr>
+            <w:tcW w:type="dxa" w:w="3009"/>
+          </w:tcPr>
+          <w:p>
+            <w:pPr>
+              <w:jc w:val="center"/>
+            </w:pPr>
+            <w:r>
+              <w:rPr>
+                <w:b/>
+              </w:rPr>
+              <w:t>Setting</w:t>
+            </w:r>
+          </w:p>
+        </w:tc>
+        <w:tc>
+          <w:tcPr>
+            <w:tcW w:type="dxa" w:w="3009"/>
+          </w:tcPr>
+          <w:p>
+            <w:pPr>
+              <w:jc w:val="center"/>
+            </w:pPr>
+            <w:r>
+              <w:rPr>
+                <w:b/>
+              </w:rPr>
+              <w:t>Rules Found</w:t>
+            </w:r>
+          </w:p>
+        </w:tc>
+        <w:tc>
+          <w:tcPr>
+            <w:tcW w:type="dxa" w:w="3009"/>
+          </w:tcPr>
+          <w:p>
+            <w:pPr>
+              <w:jc w:val="center"/>
+            </w:pPr>
+            <w:r>
+              <w:rPr>
+                <w:b/>
+              </w:rPr>
+              <w:t>Prediction vs Naive_Median</w:t>
+            </w:r>
+          </w:p>
+        </w:tc>
+      </w:tr>
+      <w:tr>
+        <w:tc>
+          <w:tcPr>
+            <w:tcW w:type="dxa" w:w="3009"/>
+          </w:tcPr>
+          <w:p>
+            <w:pPr>
+              <w:jc w:val="center"/>
+            </w:pPr>
+            <w:r>
+              <w:t>LOESS + equal-frequency (unsupervised)</w:t>
+            </w:r>
+          </w:p>
+        </w:tc>
+        <w:tc>
+          <w:tcPr>
+            <w:tcW w:type="dxa" w:w="3009"/>
+          </w:tcPr>
+          <w:p>
+            <w:pPr>
+              <w:jc w:val="center"/>
+            </w:pPr>
+            <w:r>
+              <w:t>0 / scenario</w:t>
+            </w:r>
+          </w:p>
+        </w:tc>
+        <w:tc>
+          <w:tcPr>
+            <w:tcW w:type="dxa" w:w="3009"/>
+          </w:tcPr>
+          <w:p>
+            <w:pPr>
+              <w:jc w:val="center"/>
+            </w:pPr>
+            <w:r>
+              <w:t>Equal (falls back to median)</w:t>
+            </w:r>
+          </w:p>
+        </w:tc>
+      </w:tr>
+      <w:tr>
+        <w:tc>
+          <w:tcPr>
+            <w:tcW w:type="dxa" w:w="3009"/>
+          </w:tcPr>
+          <w:p>
+            <w:pPr>
+              <w:jc w:val="center"/>
+            </w:pPr>
+            <w:r>
+              <w:t>Linear + equal-frequency (unsupervised)</w:t>
+            </w:r>
+          </w:p>
+        </w:tc>
+        <w:tc>
+          <w:tcPr>
+            <w:tcW w:type="dxa" w:w="3009"/>
+          </w:tcPr>
+          <w:p>
+            <w:pPr>
+              <w:jc w:val="center"/>
+            </w:pPr>
+            <w:r>
+              <w:t>Some (era-confounded)</w:t>
+            </w:r>
+          </w:p>
+        </w:tc>
+        <w:tc>
+          <w:tcPr>
+            <w:tcW w:type="dxa" w:w="3009"/>
+          </w:tcPr>
+          <w:p>
+            <w:pPr>
+              <w:jc w:val="center"/>
+            </w:pPr>
+            <w:r>
+              <w:t>Worse (+22%)</w:t>
+            </w:r>
+          </w:p>
+        </w:tc>
+      </w:tr>
+      <w:tr>
+        <w:tc>
+          <w:tcPr>
+            <w:tcW w:type="dxa" w:w="3009"/>
+          </w:tcPr>
+          <w:p>
+            <w:pPr>
+              <w:jc w:val="center"/>
+            </w:pPr>
+            <w:r>
+              <w:t>Linear + supervised cut points (per-fold)</w:t>
+            </w:r>
+          </w:p>
+        </w:tc>
+        <w:tc>
+          <w:tcPr>
+            <w:tcW w:type="dxa" w:w="3009"/>
+          </w:tcPr>
+          <w:p>
+            <w:pPr>
+              <w:jc w:val="center"/>
+            </w:pPr>
+            <w:r>
+              <w:t>24-88 / scenario</w:t>
+            </w:r>
+          </w:p>
+        </w:tc>
+        <w:tc>
+          <w:tcPr>
+            <w:tcW w:type="dxa" w:w="3009"/>
+          </w:tcPr>
+          <w:p>
+            <w:pPr>
+              <w:jc w:val="center"/>
+            </w:pPr>
+            <w:r>
+              <w:t>Much worse (+147%)</w:t>
+            </w:r>
+          </w:p>
+        </w:tc>
+      </w:tr>
+    </w:tbl>
+    <w:p>
+      <w:r>
+        <w:rPr>
+          <w:b w:val="0"/>
+          <w:i w:val="0"/>
+          <w:sz w:val="22"/>
+        </w:rPr>
+      </w:r>
+    </w:p>
+    <w:p>
+      <w:r>
+        <w:rPr>
+          <w:b w:val="0"/>
+          <w:i w:val="0"/>
+          <w:sz w:val="22"/>
+        </w:rPr>
+        <w:t>The limiting factor is not the discretization method — it is the fundamental signal-to-noise ratio of the problem. Wine production in the Douro Valley has a coefficient of variation of 47%, and the best climate features explain only ~22% of production variance (r ~ 0.47). Under these conditions:</w:t>
+      </w:r>
+    </w:p>
+    <w:p>
+      <w:pPr>
+        <w:pStyle w:val="ListBullet"/>
+      </w:pPr>
+      <w:r>
+        <w:rPr>
+          <w:sz w:val="22"/>
+        </w:rPr>
+        <w:t>Unsupervised binning produces rules with insufficient signal to overcome noise.</w:t>
+      </w:r>
+    </w:p>
+    <w:p>
+      <w:pPr>
+        <w:pStyle w:val="ListBullet"/>
+      </w:pPr>
+      <w:r>
+        <w:rPr>
+          <w:sz w:val="22"/>
+        </w:rPr>
+        <w:t>Supervised binning overfits the signal available in the training data and produces even noisier out-of-sample predictions.</w:t>
+      </w:r>
+    </w:p>
+    <w:p>
+      <w:pPr>
+        <w:pStyle w:val="ListBullet"/>
+      </w:pPr>
+      <w:r>
+        <w:rPr>
+          <w:sz w:val="22"/>
+        </w:rPr>
+        <w:t>No discretization strategy tested was able to discover generalizable rules that beat the simplest possible baseline (training median) in held-out walk-forward evaluation.</w:t>
+      </w:r>
+    </w:p>
+    <w:p>
+      <w:pPr>
+        <w:pStyle w:val="Heading2"/>
+      </w:pPr>
+      <w:r>
+        <w:rPr>
+          <w:color w:val="1F497D"/>
+        </w:rPr>
+        <w:t>12.6 Implications for the Thesis</w:t>
+      </w:r>
+    </w:p>
+    <w:p>
+      <w:r>
+        <w:rPr>
+          <w:b w:val="0"/>
+          <w:i w:val="0"/>
+          <w:sz w:val="22"/>
+        </w:rPr>
+        <w:t>This negative result is scientifically valuable. It confirms that the conclusion from Sections 9-11 is robust to methodological choices: the inability of rule-based models to predict Douro Valley wine production is not an artefact of any single implementation decision (detrending method, feature selection, bin count, bin strategy). It reflects a genuine property of the system — that year-to-year production variability is driven by factors too numerous and interacting for simple rule structures to capture reliably from 60-80 historical observations.</w:t>
+      </w:r>
+    </w:p>
+    <w:p>
+      <w:r>
+        <w:rPr>
+          <w:b w:val="0"/>
+          <w:i w:val="0"/>
+          <w:sz w:val="22"/>
+        </w:rPr>
+        <w:t>The finding that CarenR can discover interpretable meteorological rules (flowering-phase soil water, rainfall at key phenological windows) while failing at out-of-sample prediction is consistent with the broader literature on rule-based learning in high-noise domains: discovered rules describe historical tendencies, not predictive laws.</w:t>
+      </w:r>
+    </w:p>
     <w:sectPr>
       <w:pgSz w:w="11906" w:h="16838"/>
       <w:pgMar w:top="1440" w:right="1440" w:bottom="1440" w:left="1440" w:header="720" w:footer="720" w:gutter="0"/>

</xml_diff>